<commit_message>
Subida de CACIF-AAQA y corrección de algunos documentos
</commit_message>
<xml_diff>
--- a/Desarrollo/CACIF/Diseño/CACIF-DA.docx
+++ b/Desarrollo/CACIF/Diseño/CACIF-DA.docx
@@ -878,8 +878,12 @@
             </w:pPr>
             <w:r>
               <w:rPr>
-                <w:rtl w:val="0"/>
-              </w:rPr>
+                <w:rFonts w:ascii="Times New Roman" w:cs="Times New Roman" w:eastAsia="Times New Roman" w:hAnsi="Times New Roman"/>
+                <w:sz w:val="20"/>
+                <w:szCs w:val="20"/>
+                <w:rtl w:val="0"/>
+              </w:rPr>
+              <w:t xml:space="preserve">10/06/2026</w:t>
             </w:r>
           </w:p>
         </w:tc>
@@ -906,8 +910,12 @@
             </w:pPr>
             <w:r>
               <w:rPr>
-                <w:rtl w:val="0"/>
-              </w:rPr>
+                <w:rFonts w:ascii="Times New Roman" w:cs="Times New Roman" w:eastAsia="Times New Roman" w:hAnsi="Times New Roman"/>
+                <w:sz w:val="20"/>
+                <w:szCs w:val="20"/>
+                <w:rtl w:val="0"/>
+              </w:rPr>
+              <w:t xml:space="preserve">1.2</w:t>
             </w:r>
           </w:p>
         </w:tc>
@@ -934,8 +942,12 @@
             </w:pPr>
             <w:r>
               <w:rPr>
-                <w:rtl w:val="0"/>
-              </w:rPr>
+                <w:rFonts w:ascii="Times New Roman" w:cs="Times New Roman" w:eastAsia="Times New Roman" w:hAnsi="Times New Roman"/>
+                <w:sz w:val="20"/>
+                <w:szCs w:val="20"/>
+                <w:rtl w:val="0"/>
+              </w:rPr>
+              <w:t xml:space="preserve">Cambio de modelo LLM de Gemini </w:t>
             </w:r>
           </w:p>
         </w:tc>
@@ -962,8 +974,12 @@
             </w:pPr>
             <w:r>
               <w:rPr>
-                <w:rtl w:val="0"/>
-              </w:rPr>
+                <w:rFonts w:ascii="Times New Roman" w:cs="Times New Roman" w:eastAsia="Times New Roman" w:hAnsi="Times New Roman"/>
+                <w:sz w:val="20"/>
+                <w:szCs w:val="20"/>
+                <w:rtl w:val="0"/>
+              </w:rPr>
+              <w:t xml:space="preserve">Andre Melendez Cava</w:t>
             </w:r>
           </w:p>
         </w:tc>
@@ -1254,7 +1270,7 @@
     </w:p>
     <w:sdt>
       <w:sdtPr>
-        <w:id w:val="227595757"/>
+        <w:id w:val="1883803002"/>
         <w:docPartObj>
           <w:docPartGallery w:val="Table of Contents"/>
           <w:docPartUnique w:val="1"/>
@@ -4654,12 +4670,12 @@
           <wp:inline distB="0" distT="0" distL="0" distR="0">
             <wp:extent cx="5524500" cy="2457450"/>
             <wp:effectExtent b="0" l="0" r="0" t="0"/>
-            <wp:docPr id="3" name="image3.png"/>
+            <wp:docPr id="3" name="image1.png"/>
             <a:graphic>
               <a:graphicData uri="http://schemas.openxmlformats.org/drawingml/2006/picture">
                 <pic:pic>
                   <pic:nvPicPr>
-                    <pic:cNvPr id="0" name="image3.png"/>
+                    <pic:cNvPr id="0" name="image1.png"/>
                     <pic:cNvPicPr preferRelativeResize="0"/>
                   </pic:nvPicPr>
                   <pic:blipFill>
@@ -7374,12 +7390,12 @@
           <wp:inline distB="114300" distT="114300" distL="114300" distR="114300">
             <wp:extent cx="3648075" cy="3867150"/>
             <wp:effectExtent b="0" l="0" r="0" t="0"/>
-            <wp:docPr id="2" name="image1.png"/>
+            <wp:docPr id="2" name="image3.png"/>
             <a:graphic>
               <a:graphicData uri="http://schemas.openxmlformats.org/drawingml/2006/picture">
                 <pic:pic>
                   <pic:nvPicPr>
-                    <pic:cNvPr id="0" name="image1.png"/>
+                    <pic:cNvPr id="0" name="image3.png"/>
                     <pic:cNvPicPr preferRelativeResize="0"/>
                   </pic:nvPicPr>
                   <pic:blipFill>
@@ -9652,7 +9668,7 @@
                 <w:szCs w:val="24"/>
                 <w:rtl w:val="0"/>
               </w:rPr>
-              <w:t xml:space="preserve">gemini-1.5-flash</w:t>
+              <w:t xml:space="preserve">gemini-2.5-flash</w:t>
             </w:r>
           </w:p>
         </w:tc>

</xml_diff>